<commit_message>
Ya la mayoría está lleno de la tabla
</commit_message>
<xml_diff>
--- a/Informe_calidad_datos.docx
+++ b/Informe_calidad_datos.docx
@@ -60,13 +60,21 @@
           <w:tcPr>
             <w:tcW w:w="2943" w:type="dxa"/>
           </w:tcPr>
-          <w:p/>
-        </w:tc>
-        <w:tc>
-          <w:tcPr>
-            <w:tcW w:w="2943" w:type="dxa"/>
-          </w:tcPr>
-          <w:p/>
+          <w:p>
+            <w:r>
+              <w:t>9728 filas</w:t>
+            </w:r>
+          </w:p>
+        </w:tc>
+        <w:tc>
+          <w:tcPr>
+            <w:tcW w:w="2943" w:type="dxa"/>
+          </w:tcPr>
+          <w:p>
+            <w:r>
+              <w:t>Se procedió a eliminar 22 registros vacíos, de manera que el total del conjunto asciende a 9706 registros en total</w:t>
+            </w:r>
+          </w:p>
         </w:tc>
       </w:tr>
       <w:tr>
@@ -84,13 +92,21 @@
           <w:tcPr>
             <w:tcW w:w="2943" w:type="dxa"/>
           </w:tcPr>
-          <w:p/>
-        </w:tc>
-        <w:tc>
-          <w:tcPr>
-            <w:tcW w:w="2943" w:type="dxa"/>
-          </w:tcPr>
-          <w:p/>
+          <w:p>
+            <w:r>
+              <w:t>17 variables</w:t>
+            </w:r>
+          </w:p>
+        </w:tc>
+        <w:tc>
+          <w:tcPr>
+            <w:tcW w:w="2943" w:type="dxa"/>
+          </w:tcPr>
+          <w:p>
+            <w:r>
+              <w:t>Dada la poca información brindada por la columna DEPARTAMENTAL, esta ha sido eliminada del conjunto, razón por la que ahora hay solo 16 variables.</w:t>
+            </w:r>
+          </w:p>
         </w:tc>
       </w:tr>
       <w:tr>
@@ -108,7 +124,11 @@
           <w:tcPr>
             <w:tcW w:w="2943" w:type="dxa"/>
           </w:tcPr>
-          <w:p/>
+          <w:p>
+            <w:r>
+              <w:t>Hay un total de 2929 celdas con valores faltantes, lo que representa aproximadamente un 30.1090% de los datos</w:t>
+            </w:r>
+          </w:p>
         </w:tc>
         <w:tc>
           <w:tcPr>
@@ -132,13 +152,21 @@
           <w:tcPr>
             <w:tcW w:w="2943" w:type="dxa"/>
           </w:tcPr>
-          <w:p/>
-        </w:tc>
-        <w:tc>
-          <w:tcPr>
-            <w:tcW w:w="2943" w:type="dxa"/>
-          </w:tcPr>
-          <w:p/>
+          <w:p>
+            <w:r>
+              <w:t>Las 17 variables tienen al menos un valor faltante</w:t>
+            </w:r>
+          </w:p>
+        </w:tc>
+        <w:tc>
+          <w:tcPr>
+            <w:tcW w:w="2943" w:type="dxa"/>
+          </w:tcPr>
+          <w:p>
+            <w:r>
+              <w:t>Tras la limpieza hay 0 variables con valores nulos.</w:t>
+            </w:r>
+          </w:p>
         </w:tc>
       </w:tr>
       <w:tr>
@@ -156,13 +184,21 @@
           <w:tcPr>
             <w:tcW w:w="2943" w:type="dxa"/>
           </w:tcPr>
-          <w:p/>
-        </w:tc>
-        <w:tc>
-          <w:tcPr>
-            <w:tcW w:w="2943" w:type="dxa"/>
-          </w:tcPr>
-          <w:p/>
+          <w:p>
+            <w:r>
+              <w:t>Se han encontrado en total 0 duplicados exactos</w:t>
+            </w:r>
+          </w:p>
+        </w:tc>
+        <w:tc>
+          <w:tcPr>
+            <w:tcW w:w="2943" w:type="dxa"/>
+          </w:tcPr>
+          <w:p>
+            <w:r>
+              <w:t>Se han encontrado exactamente 0 duplicados exactos.</w:t>
+            </w:r>
+          </w:p>
         </w:tc>
       </w:tr>
       <w:tr>
@@ -204,13 +240,21 @@
           <w:tcPr>
             <w:tcW w:w="2943" w:type="dxa"/>
           </w:tcPr>
-          <w:p/>
-        </w:tc>
-        <w:tc>
-          <w:tcPr>
-            <w:tcW w:w="2943" w:type="dxa"/>
-          </w:tcPr>
-          <w:p/>
+          <w:p>
+            <w:r>
+              <w:t>8 variables con inconsistencias del formato: (DISTRITO, DEPARTAMENTO, MUNICIPIO, ESTABLECIMIENTO, DIRECCION, TELEFONO, SUPERVISOR, DIRECTOR)</w:t>
+            </w:r>
+          </w:p>
+        </w:tc>
+        <w:tc>
+          <w:tcPr>
+            <w:tcW w:w="2943" w:type="dxa"/>
+          </w:tcPr>
+          <w:p>
+            <w:r>
+              <w:t>0 variables inconsistentes. Todos los valores están en mayúsculas, no tienen tildes ni espacios.</w:t>
+            </w:r>
+          </w:p>
         </w:tc>
       </w:tr>
       <w:tr>
@@ -234,7 +278,11 @@
           <w:tcPr>
             <w:tcW w:w="2943" w:type="dxa"/>
           </w:tcPr>
-          <w:p/>
+          <w:p>
+            <w:r>
+              <w:t>0 variables con tipo incorrecto. Se ha verificado esto en particular para TELEFONO.</w:t>
+            </w:r>
+          </w:p>
         </w:tc>
       </w:tr>
       <w:tr>

</xml_diff>

<commit_message>
Informe datos. No terminado, pero ligeramente modificado.
</commit_message>
<xml_diff>
--- a/Informe_calidad_datos.docx
+++ b/Informe_calidad_datos.docx
@@ -134,7 +134,11 @@
           <w:tcPr>
             <w:tcW w:w="2943" w:type="dxa"/>
           </w:tcPr>
-          <w:p/>
+          <w:p>
+            <w:r>
+              <w:t>Se han encontrado 0 valores faltantes tras la limpieza del conjunto.</w:t>
+            </w:r>
+          </w:p>
         </w:tc>
       </w:tr>
       <w:tr>

</xml_diff>

<commit_message>
Ya solo faltan las últimas dos filas del análisis.
</commit_message>
<xml_diff>
--- a/Informe_calidad_datos.docx
+++ b/Informe_calidad_datos.docx
@@ -220,13 +220,26 @@
           <w:tcPr>
             <w:tcW w:w="2943" w:type="dxa"/>
           </w:tcPr>
-          <w:p/>
-        </w:tc>
-        <w:tc>
-          <w:tcPr>
-            <w:tcW w:w="2943" w:type="dxa"/>
-          </w:tcPr>
-          <w:p/>
+          <w:p>
+            <w:r>
+              <w:t xml:space="preserve">La columna DEPARTAMENTAL es considerada un posible duplicado de la columna DEPARTAMENTO, ya que posee los mismos valores con ciertas diferencias referente al departamento de GUATEMALA (subdividido en oriente, occidente, norte y sur), así como del departamento de QUICHÉ (con subdivisión norte y Quiché en la misma columna). Es así como en este caso se podrían considerar los 9728 registros como posibles </w:t>
+            </w:r>
+            <w:r>
+              <w:lastRenderedPageBreak/>
+              <w:t>duplicados y no duplicados exactos, ya que se encuentran en columnas distintas.</w:t>
+            </w:r>
+          </w:p>
+        </w:tc>
+        <w:tc>
+          <w:tcPr>
+            <w:tcW w:w="2943" w:type="dxa"/>
+          </w:tcPr>
+          <w:p>
+            <w:r>
+              <w:lastRenderedPageBreak/>
+              <w:t>Después de eliminar la columna DEPARTAMENTAL y de estandarizar el formato de todos los valores, se tienen 0 posibles valores duplicados.</w:t>
+            </w:r>
+          </w:p>
         </w:tc>
       </w:tr>
       <w:tr>
@@ -276,7 +289,11 @@
           <w:tcPr>
             <w:tcW w:w="2943" w:type="dxa"/>
           </w:tcPr>
-          <w:p/>
+          <w:p>
+            <w:r>
+              <w:t>0 variables con tipo incorrecto.</w:t>
+            </w:r>
+          </w:p>
         </w:tc>
         <w:tc>
           <w:tcPr>

</xml_diff>

<commit_message>
Comparación variables ANTES vs. DESPUES Terminada.
</commit_message>
<xml_diff>
--- a/Informe_calidad_datos.docx
+++ b/Informe_calidad_datos.docx
@@ -321,13 +321,21 @@
           <w:tcPr>
             <w:tcW w:w="2943" w:type="dxa"/>
           </w:tcPr>
-          <w:p/>
-        </w:tc>
-        <w:tc>
-          <w:tcPr>
-            <w:tcW w:w="2943" w:type="dxa"/>
-          </w:tcPr>
-          <w:p/>
+          <w:p>
+            <w:r>
+              <w:t>0 categorías inconsistentes</w:t>
+            </w:r>
+          </w:p>
+        </w:tc>
+        <w:tc>
+          <w:tcPr>
+            <w:tcW w:w="2943" w:type="dxa"/>
+          </w:tcPr>
+          <w:p>
+            <w:r>
+              <w:t>0 categorías inconsistentes</w:t>
+            </w:r>
+          </w:p>
         </w:tc>
       </w:tr>
       <w:tr>
@@ -345,12 +353,43 @@
           <w:tcPr>
             <w:tcW w:w="2943" w:type="dxa"/>
           </w:tcPr>
+          <w:p>
+            <w:r>
+              <w:t>0 errores corregidos al inicio, naturalmente.</w:t>
+            </w:r>
+          </w:p>
+        </w:tc>
+        <w:tc>
+          <w:tcPr>
+            <w:tcW w:w="2943" w:type="dxa"/>
+          </w:tcPr>
+          <w:p>
+            <w:r>
+              <w:t>Durante la limpieza, se han corregido aproximadamente 10 tipos de error distintos: eliminación de filas vacías; cambios en la columna DISTRITO, ESTABLECIMIENTO</w:t>
+            </w:r>
+            <w:r>
+              <w:t>,</w:t>
+            </w:r>
+            <w:r>
+              <w:t xml:space="preserve"> DIRECCION</w:t>
+            </w:r>
+            <w:r>
+              <w:t>, SUPERVISOR y DIRECTOR relacionados a su transformación de un formato estándar en mayúsculas y sin espacios.</w:t>
+            </w:r>
+          </w:p>
           <w:p/>
-        </w:tc>
-        <w:tc>
-          <w:tcPr>
-            <w:tcW w:w="2943" w:type="dxa"/>
-          </w:tcPr>
+          <w:p>
+            <w:r>
+              <w:t>A la variable TELEFONO se le quitaron los guiones y barras para dejar solo un espacio; asimismo se estableció la longitud de 8 dígitos para que pueda ser considerado un número válido.</w:t>
+            </w:r>
+          </w:p>
+          <w:p/>
+          <w:p>
+            <w:r>
+              <w:lastRenderedPageBreak/>
+              <w:t>En última instancia se eliminó la variable DEPARTAMENTAL por ser considerada redundante en relación a la variable DEPARTAMENTO.</w:t>
+            </w:r>
+          </w:p>
           <w:p/>
         </w:tc>
       </w:tr>

</xml_diff>